<commit_message>
docs(report): section 3.9 — Devin experiment loop results (Plan W-Z2): honest headline 0.7041/0.9899 replicated, council review
</commit_message>
<xml_diff>
--- a/BaoCao_DHGCMDA.docx
+++ b/BaoCao_DHGCMDA.docx
@@ -506,6 +506,23 @@
         </w:rPr>
         <w:tab/>
         <w:t>27</w:t>
+      </w:r>
+    </w:p>
+    <w:p>
+      <w:r>
+        <w:rPr>
+          <w:rFonts w:ascii="Times New Roman" w:hAnsi="Times New Roman"/>
+          <w:sz w:val="24"/>
+        </w:rPr>
+        <w:t xml:space="preserve">  3.9. Cải thiện kết quả — Devin experiment loop (Plan W–Z2)</w:t>
+      </w:r>
+      <w:r>
+        <w:rPr>
+          <w:rFonts w:ascii="Times New Roman" w:hAnsi="Times New Roman"/>
+          <w:sz w:val="24"/>
+        </w:rPr>
+        <w:tab/>
+        <w:t>29</w:t>
       </w:r>
     </w:p>
     <w:p>
@@ -25282,6 +25299,844 @@
           <w:sz w:val="26"/>
         </w:rPr>
         <w:t>Cung cấp exact training seed paper dùng để facilitate exact reproduction.</w:t>
+      </w:r>
+    </w:p>
+    <w:p>
+      <w:r>
+        <w:br w:type="page"/>
+      </w:r>
+    </w:p>
+    <w:p>
+      <w:pPr>
+        <w:pStyle w:val="Heading2"/>
+      </w:pPr>
+      <w:r>
+        <w:rPr>
+          <w:rFonts w:ascii="Times New Roman" w:hAnsi="Times New Roman" w:eastAsia="Times New Roman"/>
+          <w:color w:val="1F3A5F"/>
+        </w:rPr>
+        <w:t>3.9. Cải thiện kết quả — Devin experiment loop (Plan W–Z2)</w:t>
+      </w:r>
+    </w:p>
+    <w:p>
+      <w:pPr>
+        <w:jc w:val="both"/>
+      </w:pPr>
+      <w:r>
+        <w:rPr>
+          <w:rFonts w:ascii="Times New Roman" w:hAnsi="Times New Roman" w:eastAsia="Times New Roman"/>
+          <w:b w:val="0"/>
+          <w:i w:val="0"/>
+          <w:sz w:val="26"/>
+        </w:rPr>
+        <w:t>Sau khi reproduce hoàn tất, một vòng lặp thí nghiệm kiểu ScientistTwo (ideate → screen → full-run → ledger) đã chạy 5 round trên nhánh `devin/wf-r4-tools` để tìm phương án cải thiện kết quả paper trên v2.0_495m383D (baseline paper: Top-1 F1 = 0.5970, AUC = 0.9669).</w:t>
+      </w:r>
+    </w:p>
+    <w:p>
+      <w:pPr>
+        <w:pStyle w:val="Heading3"/>
+      </w:pPr>
+      <w:r>
+        <w:rPr>
+          <w:rFonts w:ascii="Times New Roman" w:hAnsi="Times New Roman" w:eastAsia="Times New Roman"/>
+          <w:color w:val="1F3A5F"/>
+        </w:rPr>
+        <w:t>3.9.1. Thiết lập</w:t>
+      </w:r>
+    </w:p>
+    <w:p>
+      <w:pPr>
+        <w:pStyle w:val="ListBullet"/>
+      </w:pPr>
+      <w:r>
+        <w:rPr>
+          <w:rFonts w:ascii="Times New Roman" w:hAnsi="Times New Roman" w:eastAsia="Times New Roman"/>
+          <w:sz w:val="26"/>
+        </w:rPr>
+        <w:t>**Winner config** (tìm được Round 1): `--loss_mode softmax_5class --ablation no_cl_rebuild --predictor_mode full_bilinear` — single-model 4-seed mean Top-1 F1 = 0.6834 (mọi seed ≥ 0.6666 &gt; paper).</w:t>
+      </w:r>
+    </w:p>
+    <w:p>
+      <w:pPr>
+        <w:pStyle w:val="ListBullet"/>
+      </w:pPr>
+      <w:r>
+        <w:rPr>
+          <w:rFonts w:ascii="Times New Roman" w:hAnsi="Times New Roman" w:eastAsia="Times New Roman"/>
+          <w:sz w:val="26"/>
+        </w:rPr>
+        <w:t>**Protocol chuẩn**: 650 epochs × 5-fold trên split cố định (`folds_s1.pt`, `--load_folds`), ensemble = probability-average preds của nhiều seed/config (`eval_ensemble.py`).</w:t>
+      </w:r>
+    </w:p>
+    <w:p>
+      <w:pPr>
+        <w:pStyle w:val="ListBullet"/>
+      </w:pPr>
+      <w:r>
+        <w:rPr>
+          <w:rFonts w:ascii="Times New Roman" w:hAnsi="Times New Roman" w:eastAsia="Times New Roman"/>
+          <w:sz w:val="26"/>
+        </w:rPr>
+        <w:t>**Screen protocol**: 3-seed ensemble, 2-fold, 300ep — đã verify rank đúng 3/3 (mọi PASS đều cải thiện ở full), mặc dù underestimate ~8pp.</w:t>
+      </w:r>
+    </w:p>
+    <w:p>
+      <w:pPr>
+        <w:pStyle w:val="ListBullet"/>
+      </w:pPr>
+      <w:r>
+        <w:rPr>
+          <w:rFonts w:ascii="Times New Roman" w:hAnsi="Times New Roman" w:eastAsia="Times New Roman"/>
+          <w:sz w:val="26"/>
+        </w:rPr>
+        <w:t>Kỷ luật trung thực: matched-protocol comparisons, báo cáo mean±std hoặc ensemble (không cherry-pick single seed), không sửa `Calculate_Metrics.py`.</w:t>
+      </w:r>
+    </w:p>
+    <w:p>
+      <w:pPr>
+        <w:pStyle w:val="Heading3"/>
+      </w:pPr>
+      <w:r>
+        <w:rPr>
+          <w:rFonts w:ascii="Times New Roman" w:hAnsi="Times New Roman" w:eastAsia="Times New Roman"/>
+          <w:color w:val="1F3A5F"/>
+        </w:rPr>
+        <w:t>3.9.2. Timeline kết quả</w:t>
+      </w:r>
+    </w:p>
+    <w:p>
+      <w:pPr>
+        <w:jc w:val="center"/>
+      </w:pPr>
+      <w:r>
+        <w:rPr>
+          <w:rFonts w:ascii="Times New Roman" w:hAnsi="Times New Roman"/>
+          <w:b/>
+          <w:i/>
+          <w:sz w:val="24"/>
+        </w:rPr>
+        <w:t>Bảng. Kết quả các round cải thiện (v2.0, full protocol).</w:t>
+      </w:r>
+    </w:p>
+    <w:tbl>
+      <w:tblPr>
+        <w:tblStyle w:val="LightGrid-Accent1"/>
+        <w:tblW w:type="auto" w:w="0"/>
+        <w:jc w:val="center"/>
+        <w:tblLook w:firstColumn="1" w:firstRow="1" w:lastColumn="0" w:lastRow="0" w:noHBand="0" w:noVBand="1" w:val="04A0"/>
+      </w:tblPr>
+      <w:tblGrid>
+        <w:gridCol w:w="1938"/>
+        <w:gridCol w:w="1938"/>
+        <w:gridCol w:w="1938"/>
+        <w:gridCol w:w="1938"/>
+        <w:gridCol w:w="1938"/>
+      </w:tblGrid>
+      <w:tr>
+        <w:tc>
+          <w:tcPr>
+            <w:tcW w:type="dxa" w:w="1938"/>
+          </w:tcPr>
+          <w:p>
+            <w:pPr>
+              <w:jc w:val="center"/>
+            </w:pPr>
+            <w:r/>
+            <w:r>
+              <w:rPr>
+                <w:rFonts w:ascii="Times New Roman" w:hAnsi="Times New Roman"/>
+                <w:b/>
+                <w:sz w:val="24"/>
+              </w:rPr>
+              <w:t>Round</w:t>
+            </w:r>
+          </w:p>
+        </w:tc>
+        <w:tc>
+          <w:tcPr>
+            <w:tcW w:type="dxa" w:w="1938"/>
+          </w:tcPr>
+          <w:p>
+            <w:pPr>
+              <w:jc w:val="center"/>
+            </w:pPr>
+            <w:r/>
+            <w:r>
+              <w:rPr>
+                <w:rFonts w:ascii="Times New Roman" w:hAnsi="Times New Roman"/>
+                <w:b/>
+                <w:sz w:val="24"/>
+              </w:rPr>
+              <w:t>Config</w:t>
+            </w:r>
+          </w:p>
+        </w:tc>
+        <w:tc>
+          <w:tcPr>
+            <w:tcW w:type="dxa" w:w="1938"/>
+          </w:tcPr>
+          <w:p>
+            <w:pPr>
+              <w:jc w:val="center"/>
+            </w:pPr>
+            <w:r/>
+            <w:r>
+              <w:rPr>
+                <w:rFonts w:ascii="Times New Roman" w:hAnsi="Times New Roman"/>
+                <w:b/>
+                <w:sz w:val="24"/>
+              </w:rPr>
+              <w:t>Top-1 F1</w:t>
+            </w:r>
+          </w:p>
+        </w:tc>
+        <w:tc>
+          <w:tcPr>
+            <w:tcW w:type="dxa" w:w="1938"/>
+          </w:tcPr>
+          <w:p>
+            <w:pPr>
+              <w:jc w:val="center"/>
+            </w:pPr>
+            <w:r/>
+            <w:r>
+              <w:rPr>
+                <w:rFonts w:ascii="Times New Roman" w:hAnsi="Times New Roman"/>
+                <w:b/>
+                <w:sz w:val="24"/>
+              </w:rPr>
+              <w:t>AUC</w:t>
+            </w:r>
+          </w:p>
+        </w:tc>
+        <w:tc>
+          <w:tcPr>
+            <w:tcW w:type="dxa" w:w="1938"/>
+          </w:tcPr>
+          <w:p>
+            <w:pPr>
+              <w:jc w:val="center"/>
+            </w:pPr>
+            <w:r/>
+            <w:r>
+              <w:rPr>
+                <w:rFonts w:ascii="Times New Roman" w:hAnsi="Times New Roman"/>
+                <w:b/>
+                <w:sz w:val="24"/>
+              </w:rPr>
+              <w:t>Ghi chú</w:t>
+            </w:r>
+          </w:p>
+        </w:tc>
+      </w:tr>
+      <w:tr>
+        <w:tc>
+          <w:tcPr>
+            <w:tcW w:type="dxa" w:w="1938"/>
+          </w:tcPr>
+          <w:p>
+            <w:r/>
+            <w:r>
+              <w:rPr>
+                <w:rFonts w:ascii="Times New Roman" w:hAnsi="Times New Roman"/>
+                <w:sz w:val="22"/>
+              </w:rPr>
+              <w:t>Round 1 (W)</w:t>
+            </w:r>
+          </w:p>
+        </w:tc>
+        <w:tc>
+          <w:tcPr>
+            <w:tcW w:type="dxa" w:w="1938"/>
+          </w:tcPr>
+          <w:p>
+            <w:r/>
+            <w:r>
+              <w:rPr>
+                <w:rFonts w:ascii="Times New Roman" w:hAnsi="Times New Roman"/>
+                <w:sz w:val="22"/>
+              </w:rPr>
+              <w:t>Winner config (single model, 4 seeds)</w:t>
+            </w:r>
+          </w:p>
+        </w:tc>
+        <w:tc>
+          <w:tcPr>
+            <w:tcW w:type="dxa" w:w="1938"/>
+          </w:tcPr>
+          <w:p>
+            <w:r/>
+            <w:r>
+              <w:rPr>
+                <w:rFonts w:ascii="Times New Roman" w:hAnsi="Times New Roman"/>
+                <w:sz w:val="22"/>
+              </w:rPr>
+              <w:t>0.6834</w:t>
+            </w:r>
+          </w:p>
+        </w:tc>
+        <w:tc>
+          <w:tcPr>
+            <w:tcW w:type="dxa" w:w="1938"/>
+          </w:tcPr>
+          <w:p>
+            <w:r/>
+            <w:r>
+              <w:rPr>
+                <w:rFonts w:ascii="Times New Roman" w:hAnsi="Times New Roman"/>
+                <w:sz w:val="22"/>
+              </w:rPr>
+              <w:t>0.9850</w:t>
+            </w:r>
+          </w:p>
+        </w:tc>
+        <w:tc>
+          <w:tcPr>
+            <w:tcW w:type="dxa" w:w="1938"/>
+          </w:tcPr>
+          <w:p>
+            <w:r/>
+            <w:r>
+              <w:rPr>
+                <w:rFonts w:ascii="Times New Roman" w:hAnsi="Times New Roman"/>
+                <w:sz w:val="22"/>
+              </w:rPr>
+              <w:t>+14.5% Top-1 vs paper — break-through</w:t>
+            </w:r>
+          </w:p>
+        </w:tc>
+      </w:tr>
+      <w:tr>
+        <w:tc>
+          <w:tcPr>
+            <w:tcW w:type="dxa" w:w="1938"/>
+          </w:tcPr>
+          <w:p>
+            <w:r/>
+            <w:r>
+              <w:rPr>
+                <w:rFonts w:ascii="Times New Roman" w:hAnsi="Times New Roman"/>
+                <w:sz w:val="22"/>
+              </w:rPr>
+              <w:t>Round 3 (Y)</w:t>
+            </w:r>
+          </w:p>
+        </w:tc>
+        <w:tc>
+          <w:tcPr>
+            <w:tcW w:type="dxa" w:w="1938"/>
+          </w:tcPr>
+          <w:p>
+            <w:r/>
+            <w:r>
+              <w:rPr>
+                <w:rFonts w:ascii="Times New Roman" w:hAnsi="Times New Roman"/>
+                <w:sz w:val="22"/>
+              </w:rPr>
+              <w:t>4-seed prob-ensemble, fixed split</w:t>
+            </w:r>
+          </w:p>
+        </w:tc>
+        <w:tc>
+          <w:tcPr>
+            <w:tcW w:type="dxa" w:w="1938"/>
+          </w:tcPr>
+          <w:p>
+            <w:r/>
+            <w:r>
+              <w:rPr>
+                <w:rFonts w:ascii="Times New Roman" w:hAnsi="Times New Roman"/>
+                <w:sz w:val="22"/>
+              </w:rPr>
+              <w:t>0.6926</w:t>
+            </w:r>
+          </w:p>
+        </w:tc>
+        <w:tc>
+          <w:tcPr>
+            <w:tcW w:type="dxa" w:w="1938"/>
+          </w:tcPr>
+          <w:p>
+            <w:r/>
+            <w:r>
+              <w:rPr>
+                <w:rFonts w:ascii="Times New Roman" w:hAnsi="Times New Roman"/>
+                <w:sz w:val="22"/>
+              </w:rPr>
+              <w:t>0.9890</w:t>
+            </w:r>
+          </w:p>
+        </w:tc>
+        <w:tc>
+          <w:tcPr>
+            <w:tcW w:type="dxa" w:w="1938"/>
+          </w:tcPr>
+          <w:p>
+            <w:r/>
+            <w:r>
+              <w:rPr>
+                <w:rFonts w:ascii="Times New Roman" w:hAnsi="Times New Roman"/>
+                <w:sz w:val="22"/>
+              </w:rPr>
+              <w:t>Variance reduction +0.8pp</w:t>
+            </w:r>
+          </w:p>
+        </w:tc>
+      </w:tr>
+      <w:tr>
+        <w:tc>
+          <w:tcPr>
+            <w:tcW w:type="dxa" w:w="1938"/>
+          </w:tcPr>
+          <w:p>
+            <w:r/>
+            <w:r>
+              <w:rPr>
+                <w:rFonts w:ascii="Times New Roman" w:hAnsi="Times New Roman"/>
+                <w:sz w:val="22"/>
+              </w:rPr>
+              <w:t>Round 4 (Z)</w:t>
+            </w:r>
+          </w:p>
+        </w:tc>
+        <w:tc>
+          <w:tcPr>
+            <w:tcW w:type="dxa" w:w="1938"/>
+          </w:tcPr>
+          <w:p>
+            <w:r/>
+            <w:r>
+              <w:rPr>
+                <w:rFonts w:ascii="Times New Roman" w:hAnsi="Times New Roman"/>
+                <w:sz w:val="22"/>
+              </w:rPr>
+              <w:t>`--neg_ratio 5`, 4-seed ensemble</w:t>
+            </w:r>
+          </w:p>
+        </w:tc>
+        <w:tc>
+          <w:tcPr>
+            <w:tcW w:type="dxa" w:w="1938"/>
+          </w:tcPr>
+          <w:p>
+            <w:r/>
+            <w:r>
+              <w:rPr>
+                <w:rFonts w:ascii="Times New Roman" w:hAnsi="Times New Roman"/>
+                <w:sz w:val="22"/>
+              </w:rPr>
+              <w:t>0.7042</w:t>
+            </w:r>
+          </w:p>
+        </w:tc>
+        <w:tc>
+          <w:tcPr>
+            <w:tcW w:type="dxa" w:w="1938"/>
+          </w:tcPr>
+          <w:p>
+            <w:r/>
+            <w:r>
+              <w:rPr>
+                <w:rFonts w:ascii="Times New Roman" w:hAnsi="Times New Roman"/>
+                <w:sz w:val="22"/>
+              </w:rPr>
+              <w:t>0.9896</w:t>
+            </w:r>
+          </w:p>
+        </w:tc>
+        <w:tc>
+          <w:tcPr>
+            <w:tcW w:type="dxa" w:w="1938"/>
+          </w:tcPr>
+          <w:p>
+            <w:r/>
+            <w:r>
+              <w:rPr>
+                <w:rFonts w:ascii="Times New Roman" w:hAnsi="Times New Roman"/>
+                <w:sz w:val="22"/>
+              </w:rPr>
+              <w:t>Best single mechanism: negatives đang "chìm" type signal</w:t>
+            </w:r>
+          </w:p>
+        </w:tc>
+      </w:tr>
+      <w:tr>
+        <w:tc>
+          <w:tcPr>
+            <w:tcW w:type="dxa" w:w="1938"/>
+          </w:tcPr>
+          <w:p>
+            <w:r/>
+            <w:r>
+              <w:rPr>
+                <w:rFonts w:ascii="Times New Roman" w:hAnsi="Times New Roman"/>
+                <w:sz w:val="22"/>
+              </w:rPr>
+              <w:t>Round 5 (Z2)</w:t>
+            </w:r>
+          </w:p>
+        </w:tc>
+        <w:tc>
+          <w:tcPr>
+            <w:tcW w:type="dxa" w:w="1938"/>
+          </w:tcPr>
+          <w:p>
+            <w:r/>
+            <w:r>
+              <w:rPr>
+                <w:rFonts w:ascii="Times New Roman" w:hAnsi="Times New Roman"/>
+                <w:sz w:val="22"/>
+              </w:rPr>
+              <w:t>6-member: stack×4 + nohgt + diag</w:t>
+            </w:r>
+          </w:p>
+        </w:tc>
+        <w:tc>
+          <w:tcPr>
+            <w:tcW w:type="dxa" w:w="1938"/>
+          </w:tcPr>
+          <w:p>
+            <w:r/>
+            <w:r>
+              <w:rPr>
+                <w:rFonts w:ascii="Times New Roman" w:hAnsi="Times New Roman"/>
+                <w:sz w:val="22"/>
+              </w:rPr>
+              <w:t>0.7083</w:t>
+            </w:r>
+          </w:p>
+        </w:tc>
+        <w:tc>
+          <w:tcPr>
+            <w:tcW w:type="dxa" w:w="1938"/>
+          </w:tcPr>
+          <w:p>
+            <w:r/>
+            <w:r>
+              <w:rPr>
+                <w:rFonts w:ascii="Times New Roman" w:hAnsi="Times New Roman"/>
+                <w:sz w:val="22"/>
+              </w:rPr>
+              <w:t>0.9910</w:t>
+            </w:r>
+          </w:p>
+        </w:tc>
+        <w:tc>
+          <w:tcPr>
+            <w:tcW w:type="dxa" w:w="1938"/>
+          </w:tcPr>
+          <w:p>
+            <w:r/>
+            <w:r>
+              <w:rPr>
+                <w:rFonts w:ascii="Times New Roman" w:hAnsi="Times New Roman"/>
+                <w:sz w:val="22"/>
+              </w:rPr>
+              <w:t>Argmax trên split selection — xem 3.9.4</w:t>
+            </w:r>
+          </w:p>
+        </w:tc>
+      </w:tr>
+      <w:tr>
+        <w:tc>
+          <w:tcPr>
+            <w:tcW w:type="dxa" w:w="1938"/>
+          </w:tcPr>
+          <w:p>
+            <w:r/>
+            <w:r>
+              <w:rPr>
+                <w:rFonts w:ascii="Times New Roman" w:hAnsi="Times New Roman"/>
+                <w:sz w:val="22"/>
+              </w:rPr>
+              <w:t>Replication</w:t>
+            </w:r>
+          </w:p>
+        </w:tc>
+        <w:tc>
+          <w:tcPr>
+            <w:tcW w:type="dxa" w:w="1938"/>
+          </w:tcPr>
+          <w:p>
+            <w:r/>
+            <w:r>
+              <w:rPr>
+                <w:rFonts w:ascii="Times New Roman" w:hAnsi="Times New Roman"/>
+                <w:sz w:val="22"/>
+              </w:rPr>
+              <w:t>Cùng recipe trên split độc lập (folds_s42)</w:t>
+            </w:r>
+          </w:p>
+        </w:tc>
+        <w:tc>
+          <w:tcPr>
+            <w:tcW w:type="dxa" w:w="1938"/>
+          </w:tcPr>
+          <w:p>
+            <w:r/>
+            <w:r>
+              <w:rPr>
+                <w:rFonts w:ascii="Times New Roman" w:hAnsi="Times New Roman"/>
+                <w:sz w:val="22"/>
+              </w:rPr>
+              <w:t>0.7041</w:t>
+            </w:r>
+          </w:p>
+        </w:tc>
+        <w:tc>
+          <w:tcPr>
+            <w:tcW w:type="dxa" w:w="1938"/>
+          </w:tcPr>
+          <w:p>
+            <w:r/>
+            <w:r>
+              <w:rPr>
+                <w:rFonts w:ascii="Times New Roman" w:hAnsi="Times New Roman"/>
+                <w:sz w:val="22"/>
+              </w:rPr>
+              <w:t>0.9899</w:t>
+            </w:r>
+          </w:p>
+        </w:tc>
+        <w:tc>
+          <w:tcPr>
+            <w:tcW w:type="dxa" w:w="1938"/>
+          </w:tcPr>
+          <w:p>
+            <w:r/>
+            <w:r>
+              <w:rPr>
+                <w:rFonts w:ascii="Times New Roman" w:hAnsi="Times New Roman"/>
+                <w:sz w:val="22"/>
+              </w:rPr>
+              <w:t>Selection bias ≈ +0.42pp — recipe generalize</w:t>
+            </w:r>
+          </w:p>
+        </w:tc>
+      </w:tr>
+    </w:tbl>
+    <w:p>
+      <w:pPr>
+        <w:pStyle w:val="Heading3"/>
+      </w:pPr>
+      <w:r>
+        <w:rPr>
+          <w:rFonts w:ascii="Times New Roman" w:hAnsi="Times New Roman" w:eastAsia="Times New Roman"/>
+          <w:color w:val="1F3A5F"/>
+        </w:rPr>
+        <w:t>3.9.3. Mechanism đã test — thắng và thua</w:t>
+      </w:r>
+    </w:p>
+    <w:p>
+      <w:pPr>
+        <w:pStyle w:val="ListBullet"/>
+      </w:pPr>
+      <w:r>
+        <w:rPr>
+          <w:rFonts w:ascii="Times New Roman" w:hAnsi="Times New Roman" w:eastAsia="Times New Roman"/>
+          <w:sz w:val="26"/>
+        </w:rPr>
+        <w:t>**Thắng**: config-stack (sm5+noclrebuild+bilinear, +13%), neg_ratio 5 (+1.2pp), config-diversity ensemble (+0.9-1.5pp qua decorrelation), sim_threshold 0.7 (AUC specialist 0.9903).</w:t>
+      </w:r>
+    </w:p>
+    <w:p>
+      <w:pPr>
+        <w:pStyle w:val="ListBullet"/>
+      </w:pPr>
+      <w:r>
+        <w:rPr>
+          <w:rFonts w:ascii="Times New Roman" w:hAnsi="Times New Roman" w:eastAsia="Times New Roman"/>
+          <w:sz w:val="26"/>
+        </w:rPr>
+        <w:t>**Thua sạch**: cosine LR (−6.7pp), edge dropout (−1.6pp), EMA weights, recon-off, freeze-graph, nlayer-1, dropout 0.45, inter-view CL restore, raw-logits CE.</w:t>
+      </w:r>
+    </w:p>
+    <w:p>
+      <w:pPr>
+        <w:pStyle w:val="ListBullet"/>
+      </w:pPr>
+      <w:r>
+        <w:rPr>
+          <w:rFonts w:ascii="Times New Roman" w:hAnsi="Times New Roman" w:eastAsia="Times New Roman"/>
+          <w:sz w:val="26"/>
+        </w:rPr>
+        <w:t>**Sweep neg_ratio** (matched 3-seed ens): 10→0.6917, 7→0.6954, **5→0.7014 (optimum)**, 3→0.6993 — đỉnh phẳng quanh 5.</w:t>
+      </w:r>
+    </w:p>
+    <w:p>
+      <w:pPr>
+        <w:pStyle w:val="ListBullet"/>
+      </w:pPr>
+      <w:r>
+        <w:rPr>
+          <w:rFonts w:ascii="Times New Roman" w:hAnsi="Times New Roman" w:eastAsia="Times New Roman"/>
+          <w:sz w:val="26"/>
+        </w:rPr>
+        <w:t>**Dead flags đã nối**: `--lr`/`--weight_decay` (PR #6), `--similarity_threshold` (PR #8) — trước đây hardcoded, CLI bị bỏ qua.</w:t>
+      </w:r>
+    </w:p>
+    <w:p>
+      <w:pPr>
+        <w:pStyle w:val="Heading3"/>
+      </w:pPr>
+      <w:r>
+        <w:rPr>
+          <w:rFonts w:ascii="Times New Roman" w:hAnsi="Times New Roman" w:eastAsia="Times New Roman"/>
+          <w:color w:val="1F3A5F"/>
+        </w:rPr>
+        <w:t>3.9.4. Headline trung thực (sau council review)</w:t>
+      </w:r>
+    </w:p>
+    <w:p>
+      <w:pPr>
+        <w:jc w:val="both"/>
+      </w:pPr>
+      <w:r>
+        <w:rPr>
+          <w:rFonts w:ascii="Times New Roman" w:hAnsi="Times New Roman" w:eastAsia="Times New Roman"/>
+          <w:b w:val="0"/>
+          <w:i w:val="0"/>
+          <w:sz w:val="26"/>
+        </w:rPr>
+        <w:t>Council review (5 lens độc lập đọc toàn bộ ledger) kết luận số 0.7083 là argmax của ~11 combos trên MỘT split → winner's curse. Số liệu nên trình bày 2 tầng:</w:t>
+      </w:r>
+    </w:p>
+    <w:p>
+      <w:pPr>
+        <w:pStyle w:val="ListBullet"/>
+      </w:pPr>
+      <w:r>
+        <w:rPr>
+          <w:rFonts w:ascii="Times New Roman" w:hAnsi="Times New Roman" w:eastAsia="Times New Roman"/>
+          <w:sz w:val="26"/>
+        </w:rPr>
+        <w:t>**Like-for-like (single-model vs paper)**: neg_ratio5 single-seed mean **0.6923 = +16.0% vs paper 0.5970** (min seed 0.6844 = +14.4%).</w:t>
+      </w:r>
+    </w:p>
+    <w:p>
+      <w:pPr>
+        <w:pStyle w:val="ListBullet"/>
+      </w:pPr>
+      <w:r>
+        <w:rPr>
+          <w:rFonts w:ascii="Times New Roman" w:hAnsi="Times New Roman" w:eastAsia="Times New Roman"/>
+          <w:sz w:val="26"/>
+        </w:rPr>
+        <w:t>**System-level (ensemble)**: 6-member = **0.7041 / 0.9899 trên split độc lập** (folds_s42, 0/5 folds trùng s1) — đây là con số publishable.</w:t>
+      </w:r>
+    </w:p>
+    <w:p>
+      <w:pPr>
+        <w:jc w:val="both"/>
+      </w:pPr>
+      <w:r>
+        <w:rPr>
+          <w:rFonts w:ascii="Times New Roman" w:hAnsi="Times New Roman" w:eastAsia="Times New Roman"/>
+          <w:b w:val="0"/>
+          <w:i w:val="0"/>
+          <w:sz w:val="26"/>
+        </w:rPr>
+        <w:t>**Reconcile với Plan I "ceiling 62-68%"**: Plan I đo trần *reproduction fidelity* (paper-faithful, single-model, metric paper) — khác trục với improvement. Ensemble + config-delta nằm ngoài không gian Plan I định nghĩa → không mâu thuẫn.</w:t>
+      </w:r>
+    </w:p>
+    <w:p>
+      <w:pPr>
+        <w:pStyle w:val="ListBullet"/>
+      </w:pPr>
+      <w:r>
+        <w:rPr>
+          <w:rFonts w:ascii="Times New Roman" w:hAnsi="Times New Roman" w:eastAsia="Times New Roman"/>
+          <w:sz w:val="26"/>
+        </w:rPr>
+        <w:t>Finding "stack members &gt; negr members" (+0.10pp) = **statistical tie** (&lt; 0.1× fold SE, dưới thread jitter) — đã gỡ khỏi ledger như causal claim.</w:t>
+      </w:r>
+    </w:p>
+    <w:p>
+      <w:pPr>
+        <w:pStyle w:val="Heading3"/>
+      </w:pPr>
+      <w:r>
+        <w:rPr>
+          <w:rFonts w:ascii="Times New Roman" w:hAnsi="Times New Roman" w:eastAsia="Times New Roman"/>
+          <w:color w:val="1F3A5F"/>
+        </w:rPr>
+        <w:t>3.9.5. Council review — ceiling &amp; avenues còn lại</w:t>
+      </w:r>
+    </w:p>
+    <w:p>
+      <w:pPr>
+        <w:jc w:val="both"/>
+      </w:pPr>
+      <w:r>
+        <w:rPr>
+          <w:rFonts w:ascii="Times New Roman" w:hAnsi="Times New Roman" w:eastAsia="Times New Roman"/>
+          <w:b w:val="0"/>
+          <w:i w:val="0"/>
+          <w:sz w:val="26"/>
+        </w:rPr>
+        <w:t>5 lens độc lập (statistical rigor, ML methodology, adversarial skeptic, data-level avenues, strategy ROI):</w:t>
+      </w:r>
+    </w:p>
+    <w:p>
+      <w:pPr>
+        <w:pStyle w:val="ListBullet"/>
+      </w:pPr>
+      <w:r>
+        <w:rPr>
+          <w:rFonts w:ascii="Times New Roman" w:hAnsi="Times New Roman" w:eastAsia="Times New Roman"/>
+          <w:sz w:val="26"/>
+        </w:rPr>
+        <w:t>**Ceiling**: near_reached trong không gian config/mechanism/ensemble (4/5 lens — marginal deltas &lt; noise floor). **not_reached** ở data-level family: chưa từng test trên v2.0.</w:t>
+      </w:r>
+    </w:p>
+    <w:p>
+      <w:pPr>
+        <w:pStyle w:val="ListBullet"/>
+      </w:pPr>
+      <w:r>
+        <w:rPr>
+          <w:rFonts w:ascii="Times New Roman" w:hAnsi="Times New Roman" w:eastAsia="Times New Roman"/>
+          <w:sz w:val="26"/>
+        </w:rPr>
+        <w:t>**Strategy**: on_track (5/5) — vòng lặp pivot đúng mỗi round.</w:t>
+      </w:r>
+    </w:p>
+    <w:p>
+      <w:pPr>
+        <w:pStyle w:val="ListBullet"/>
+      </w:pPr>
+      <w:r>
+        <w:rPr>
+          <w:rFonts w:ascii="Times New Roman" w:hAnsi="Times New Roman" w:eastAsia="Times New Roman"/>
+          <w:sz w:val="26"/>
+        </w:rPr>
+        <w:t>**Bug mới phát hiện (data-level)**: 3 932 true positives trong `mirna-disease.txt` đang được sample như negatives (~2.1% eval set mislabeled); 181 hàng multi-type bị last-write-wins collapse.</w:t>
+      </w:r>
+    </w:p>
+    <w:p>
+      <w:pPr>
+        <w:pStyle w:val="ListBullet"/>
+      </w:pPr>
+      <w:r>
+        <w:rPr>
+          <w:rFonts w:ascii="Times New Roman" w:hAnsi="Times New Roman" w:eastAsia="Times New Roman"/>
+          <w:sz w:val="26"/>
+        </w:rPr>
+        <w:t>**Avenues in-repo chưa test** (~+1-4pp upside): decontamination negative pool, v3.2_filtered_495m383D auxiliary supervision (3 938 typed assoc, cùng entity indices), multilabel target tensor, K_neigs re-sweep dưới winner, weighted ensemble cross-fitted.</w:t>
+      </w:r>
+    </w:p>
+    <w:p>
+      <w:pPr>
+        <w:jc w:val="both"/>
+      </w:pPr>
+      <w:r>
+        <w:rPr>
+          <w:rFonts w:ascii="Times New Roman" w:hAnsi="Times New Roman" w:eastAsia="Times New Roman"/>
+          <w:b w:val="0"/>
+          <w:i w:val="0"/>
+          <w:sz w:val="26"/>
+        </w:rPr>
+        <w:t>**Kết luận**: mục tiêu "vượt paper" đạt chắc chắn — +16.0% Top-1 single-model, 0.7041/0.9899 ensemble trên split độc lập. Claim giới hạn ở v2.0 (v3.2 còn gap ~0.33 vs 0.86 do paper curation chưa public). Headroom còn lại nằm ở data-level fixes, không phải mechanism tuning.</w:t>
       </w:r>
     </w:p>
     <w:p>

</xml_diff>